<commit_message>
Start of week 4
</commit_message>
<xml_diff>
--- a/Checkpoints/Checkpoint #3 (INFO-3111).docx
+++ b/Checkpoints/Checkpoint #3 (INFO-3111).docx
@@ -220,7 +220,19 @@
     <w:p/>
     <w:p>
       <w:r>
-        <w:t xml:space="preserve">Show at least five (5) </w:t>
+        <w:t xml:space="preserve">Show at least </w:t>
+      </w:r>
+      <w:r>
+        <w:t>three</w:t>
+      </w:r>
+      <w:r>
+        <w:t xml:space="preserve"> (</w:t>
+      </w:r>
+      <w:r>
+        <w:t>3</w:t>
+      </w:r>
+      <w:r>
+        <w:t xml:space="preserve">) </w:t>
       </w:r>
       <w:r>
         <w:rPr>
@@ -268,11 +280,10 @@
         <w:t>different</w:t>
       </w:r>
       <w:r>
-        <w:t xml:space="preserve"> models. (i.e. they are different files)</w:t>
-      </w:r>
-      <w:r>
-        <w:br/>
-        <w:t>(Since there’s five (5) in total, you can repeat some of them)</w:t>
+        <w:t xml:space="preserve"> models. (i.e. they are different files</w:t>
+      </w:r>
+      <w:r>
+        <w:t>)</w:t>
       </w:r>
     </w:p>
     <w:p>
@@ -290,6 +301,9 @@
       </w:r>
       <w:r>
         <w:t xml:space="preserve"> be different colours. </w:t>
+      </w:r>
+      <w:r>
+        <w:t>They can’t be “on top of each other”.</w:t>
       </w:r>
     </w:p>
     <w:p>

</xml_diff>